<commit_message>
Polish research reports, explain notebooks, and publish evidence-based visual reading edition
</commit_message>
<xml_diff>
--- a/GCP Kafka Project.docx
+++ b/GCP Kafka Project.docx
@@ -342,7 +342,7 @@
           <w:rFonts w:ascii="Arial" w:hAnsi="Arial" w:cs="Arial"/>
           <w:highlight w:val="yellow"/>
         </w:rPr>
-        <w:t>c3dcbb8a046e4261a9f70269aef1945f</w:t>
+        <w:t>[REDACTED]</w:t>
       </w:r>
     </w:p>
     <w:p>
@@ -702,41 +702,7 @@
         <w:rPr>
           <w:rFonts w:ascii="Arial" w:hAnsi="Arial" w:cs="Arial"/>
         </w:rPr>
-        <w:drawing>
-          <wp:inline distT="0" distB="0" distL="0" distR="0" wp14:anchorId="49D80251" wp14:editId="2D9BE2C6">
-            <wp:extent cx="5943600" cy="3562350"/>
-            <wp:effectExtent l="0" t="0" r="0" b="0"/>
-            <wp:docPr id="2118619807" name="Picture 1" descr="A screenshot of a computer&#10;&#10;Description automatically generated"/>
-            <wp:cNvGraphicFramePr>
-              <a:graphicFrameLocks xmlns:a="http://schemas.openxmlformats.org/drawingml/2006/main" noChangeAspect="1"/>
-            </wp:cNvGraphicFramePr>
-            <a:graphic xmlns:a="http://schemas.openxmlformats.org/drawingml/2006/main">
-              <a:graphicData uri="http://schemas.openxmlformats.org/drawingml/2006/picture">
-                <pic:pic xmlns:pic="http://schemas.openxmlformats.org/drawingml/2006/picture">
-                  <pic:nvPicPr>
-                    <pic:cNvPr id="2118619807" name="Picture 1" descr="A screenshot of a computer&#10;&#10;Description automatically generated"/>
-                    <pic:cNvPicPr/>
-                  </pic:nvPicPr>
-                  <pic:blipFill>
-                    <a:blip r:embed="rId4"/>
-                    <a:stretch>
-                      <a:fillRect/>
-                    </a:stretch>
-                  </pic:blipFill>
-                  <pic:spPr>
-                    <a:xfrm>
-                      <a:off x="0" y="0"/>
-                      <a:ext cx="5943600" cy="3562350"/>
-                    </a:xfrm>
-                    <a:prstGeom prst="rect">
-                      <a:avLst/>
-                    </a:prstGeom>
-                  </pic:spPr>
-                </pic:pic>
-              </a:graphicData>
-            </a:graphic>
-          </wp:inline>
-        </w:drawing>
+        <w:t>[Producer screenshot removed because it exposed a service credential.]</w:t>
       </w:r>
       <w:r>
         <w:rPr>

</xml_diff>